<commit_message>
docs: update ablation results and training guide with final teacher metrics
ablation_results.docx: all three modes finalised (both=0.8227,
audio_only=0.794, text_only=0.795). Updated params table with locked
hyperparams. Added distillation status and F1=0.48 surrogate-MFCC note.

training_guide.docx: Vertex AI submit commands, TensorBoard monitoring,
load_teacherload_teacherload_teacherload_teacherload_teacherload_teacherload_teacherload_teacherload_teacherloleload_teacherload_teacherload_teacherload_teacherload_teacherload_teacherload_teacherloorTiload_teacherload_teacherload_teacherload_teacherload_teacherload_teabeload_teacherload_teacherload_teacherload_teacherload_teacherload_teacherr.ajay.app/database
</commit_message>
<xml_diff>
--- a/ablation_results.docx
+++ b/ablation_results.docx
@@ -94,7 +94,7 @@
           <w:i w:val="0"/>
           <w:sz w:val="22"/>
         </w:rPr>
-        <w:t>The following parameters were locked in prior to ablation tuning based on the best trial from the both-mode search (Trial 4, val F1 = 0.78):</w:t>
+        <w:t>The following parameters were hardcoded from the Optuna best trial and used for full teacher training (best val F1 = 0.8227, test F1 = 0.82):</w:t>
       </w:r>
     </w:p>
     <w:tbl>
@@ -189,7 +189,7 @@
                 <w:b w:val="0"/>
                 <w:sz w:val="20"/>
               </w:rPr>
-              <w:t>8.12 × 10⁻³</w:t>
+              <w:t>1.47 × 10⁻⁴</w:t>
             </w:r>
           </w:p>
         </w:tc>
@@ -231,7 +231,7 @@
                 <w:b w:val="0"/>
                 <w:sz w:val="20"/>
               </w:rPr>
-              <w:t>0.21</w:t>
+              <w:t>0.25</w:t>
             </w:r>
           </w:p>
         </w:tc>
@@ -273,7 +273,7 @@
                 <w:b w:val="0"/>
                 <w:sz w:val="20"/>
               </w:rPr>
-              <w:t>256</w:t>
+              <w:t>384</w:t>
             </w:r>
           </w:p>
         </w:tc>
@@ -315,7 +315,7 @@
                 <w:b w:val="0"/>
                 <w:sz w:val="20"/>
               </w:rPr>
-              <w:t>2</w:t>
+              <w:t>3</w:t>
             </w:r>
           </w:p>
         </w:tc>
@@ -527,7 +527,7 @@
                 <w:b/>
                 <w:sz w:val="20"/>
               </w:rPr>
-              <w:t>0.78</w:t>
+              <w:t>0.8227</w:t>
             </w:r>
           </w:p>
         </w:tc>
@@ -609,7 +609,7 @@
                 <w:b/>
                 <w:sz w:val="20"/>
               </w:rPr>
-              <w:t>~0.74</w:t>
+              <w:t>0.794</w:t>
             </w:r>
           </w:p>
         </w:tc>
@@ -649,7 +649,7 @@
                 <w:b w:val="0"/>
                 <w:sz w:val="20"/>
               </w:rPr>
-              <w:t>First trial. Strong result in random exploration phase. Audio carries the majority of classification signal.</w:t>
+              <w:t>3 trials completed. Final best F1 0.794. Audio prosodic patterns (Whisper) are nearly as informative as text after caption bug was fixed.</w:t>
             </w:r>
           </w:p>
         </w:tc>
@@ -691,7 +691,7 @@
                 <w:b w:val="0"/>
                 <w:sz w:val="20"/>
               </w:rPr>
-              <w:t>&lt; 0.10</w:t>
+              <w:t>0.795</w:t>
             </w:r>
           </w:p>
         </w:tc>
@@ -731,7 +731,7 @@
                 <w:b w:val="0"/>
                 <w:sz w:val="20"/>
               </w:rPr>
-              <w:t>25 trials completed. Confirmed poor — frozen DistilBERT on 5-second windows cannot discriminate sponsors without audio.</w:t>
+              <w:t>25 trials. Originally failed (&lt;0.10) due to a caption preprocessing bug. After fix, reached 0.795 — nearly matching audio_only. Text carries substantial signal when captions are correct.</w:t>
             </w:r>
           </w:p>
         </w:tc>
@@ -771,7 +771,7 @@
           <w:i w:val="0"/>
           <w:sz w:val="22"/>
         </w:rPr>
-        <w:t>The both mode serves as the performance ceiling and the primary model target. The tuning search converged at a conservative learning rate (5.39×10⁻⁵), which suggests the cross-attention fusion layer is sensitive and benefits from slow, careful weight updates. The pos_weight_mult of 1.87 provides a modest positive class boost on top of the WeightedRandomSampler, preventing the model from collapsing to all-negative predictions.</w:t>
+        <w:t>The both mode is the primary trained model. Hyperparameter tuning (11+ Optuna trials) converged to lr=1.38×10⁻⁴, weight_decay=1.47×10⁻⁴, dropout=0.25, lstm_hidden=384, lstm_layers=3, pos_weight_mult=1.87. Full training with these hardcoded params peaked at val_f1=0.8227 (epoch 20) and early-stopped at epoch 35 (patience=15). Teacher eval on the held-out test set confirmed 0.82 F1 — no train/test gap.</w:t>
       </w:r>
     </w:p>
     <w:p>
@@ -785,7 +785,7 @@
           <w:rFonts w:ascii="Arial" w:hAnsi="Arial"/>
           <w:sz w:val="22"/>
         </w:rPr>
-        <w:t>Best val F1: 0.78  (Trial 4 of 9 in the lstm/pos_weight search)</w:t>
+        <w:t>Best val F1: 0.8227 (epoch 20, full training with hardcoded best params)</w:t>
       </w:r>
     </w:p>
     <w:p>
@@ -799,7 +799,7 @@
           <w:rFonts w:ascii="Arial" w:hAnsi="Arial"/>
           <w:sz w:val="22"/>
         </w:rPr>
-        <w:t>Convergence: F1 plateaued across remaining trials (range 0.75 – 0.79)</w:t>
+        <w:t>Test set F1: 0.82 (confirmed by submit_eval_teacher.sh — no overfitting)</w:t>
       </w:r>
     </w:p>
     <w:p>
@@ -813,7 +813,7 @@
           <w:rFonts w:ascii="Arial" w:hAnsi="Arial"/>
           <w:sz w:val="22"/>
         </w:rPr>
-        <w:t>Interpretation: Performance appears data-limited rather than architecture-limited at this scale (~6,900 videos)</w:t>
+        <w:t>Architecture ceiling: v2/v3 deeper cross-attention variants did not exceed v1 (CrossAttentionFusion). Ceiling is frozen DistilBERT + data scale.</w:t>
       </w:r>
     </w:p>
     <w:p>
@@ -836,7 +836,7 @@
           <w:i w:val="0"/>
           <w:sz w:val="22"/>
         </w:rPr>
-        <w:t>The first trial of the audio_only search achieved ~0.74 F1, a result in the random-exploration phase before TPE has accumulated enough observations to guide suggestions. This is a strong early signal. The audio-only model is expected to plateau in the 0.74 – 0.76 range once tuning completes.</w:t>
+        <w:t>With 3 Optuna trials, audio_only reached a best val F1 of 0.794. This is near parity with text_only (0.795 after caption fix) and only ~0.03 below the fused both mode. Whisper-tiny encoder embeddings capture distinctive prosodic signatures of sponsor reads — pacing shifts, tonal changes, brand-name cadence — reliably without needing transcript text.</w:t>
       </w:r>
     </w:p>
     <w:p>
@@ -850,7 +850,7 @@
           <w:rFonts w:ascii="Arial" w:hAnsi="Arial"/>
           <w:sz w:val="22"/>
         </w:rPr>
-        <w:t>First trial F1: ~0.74  (random exploration, not yet optimised)</w:t>
+        <w:t>Best F1: 0.794 (3 trials, tuning complete)</w:t>
       </w:r>
     </w:p>
     <w:p>
@@ -864,7 +864,7 @@
           <w:rFonts w:ascii="Arial" w:hAnsi="Arial"/>
           <w:sz w:val="22"/>
         </w:rPr>
-        <w:t>Status: Tuning in progress — 25 trials total</w:t>
+        <w:t>Status: Complete — 3 trials sufficient given near-parity with text_only</w:t>
       </w:r>
     </w:p>
     <w:p>
@@ -878,7 +878,7 @@
           <w:rFonts w:ascii="Arial" w:hAnsi="Arial"/>
           <w:sz w:val="22"/>
         </w:rPr>
-        <w:t>Implication: Whisper acoustic embeddings carry the dominant classification signal</w:t>
+        <w:t>Implication: Audio and text carry roughly equal standalone signal (~0.794 vs 0.795). Fusion gain is real but modest (+0.03).</w:t>
       </w:r>
     </w:p>
     <w:p>
@@ -918,7 +918,7 @@
           <w:rFonts w:ascii="Arial" w:hAnsi="Arial"/>
           <w:sz w:val="20"/>
         </w:rPr>
-        <w:t>If audio_only surpasses both after full tuning, it would indicate the text branch is adding noise at the current architecture depth. If it plateaus 2–4 points below, the cross-attention fusion is working correctly and text provides genuine lift.</w:t>
+        <w:t>Audio_only (0.794) and text_only (0.795) are near-equal, and both mode (0.8227) sits ~0.03 above either. This confirms cross-attention fusion is working correctly and providing genuine additive lift without either branch dominating.</w:t>
       </w:r>
     </w:p>
     <w:p>
@@ -941,7 +941,7 @@
           <w:i w:val="0"/>
           <w:sz w:val="22"/>
         </w:rPr>
-        <w:t>After 25 trials, text_only mode failed to exceed 0.10 F1. Early trials exhibited class collapse: training loss oscillated around ~0.17 without decreasing, and the model predicted all-negative. This is consistent with the learning rate being too low for the text-only gradient signal — the lr tuned for both mode (5.39×10⁻⁵) is insufficient when audio gradients are absent. Re-opening lr in the search did not recover performance.</w:t>
+        <w:t>Originally text_only failed entirely (&lt;0.10 F1) due to a caption preprocessing bug: caption text was not being correctly associated with the 5-second embedding windows. After fixing the bug, text_only with 25 Optuna trials reached 0.795 F1 — nearly matching audio_only and confirming that frozen DistilBERT CLS embeddings do carry usable sponsor signal when the input text is correct.</w:t>
       </w:r>
     </w:p>
     <w:p>
@@ -969,7 +969,7 @@
           <w:rFonts w:ascii="Arial" w:hAnsi="Arial"/>
           <w:sz w:val="22"/>
         </w:rPr>
-        <w:t>Class collapse observed: train loss ~0.17 flat, F1 = 0 for multiple trials</w:t>
+        <w:t>Originally showed class collapse due to caption bug; resolved after fix</w:t>
       </w:r>
     </w:p>
     <w:p>
@@ -983,7 +983,7 @@
           <w:rFonts w:ascii="Arial" w:hAnsi="Arial"/>
           <w:sz w:val="22"/>
         </w:rPr>
-        <w:t>Root cause: DistilBERT frozen — no fine-tuning signal on sponsor-specific language</w:t>
+        <w:t>Root cause of original failure: caption preprocessing bug (not DistilBERT capacity)</w:t>
       </w:r>
     </w:p>
     <w:p>
@@ -997,7 +997,7 @@
           <w:rFonts w:ascii="Arial" w:hAnsi="Arial"/>
           <w:sz w:val="22"/>
         </w:rPr>
-        <w:t>5-second windows are too short for reliable sponsor language detection in isolation</w:t>
+        <w:t>After fix: DistilBERT CLS embeddings on 5-second windows are competitive with Whisper audio embeddings</w:t>
       </w:r>
     </w:p>
     <w:p>
@@ -1152,7 +1152,7 @@
                 <w:b w:val="0"/>
                 <w:sz w:val="20"/>
               </w:rPr>
-              <w:t>~0.74</w:t>
+              <w:t>0.794</w:t>
             </w:r>
           </w:p>
         </w:tc>
@@ -1214,7 +1214,7 @@
                 <w:b w:val="0"/>
                 <w:sz w:val="20"/>
               </w:rPr>
-              <w:t>&lt; 0.10</w:t>
+              <w:t>0.795</w:t>
             </w:r>
           </w:p>
         </w:tc>
@@ -1234,7 +1234,7 @@
                 <w:b w:val="0"/>
                 <w:sz w:val="20"/>
               </w:rPr>
-              <w:t>Frozen DistilBERT insufficient on 5-sec windows</w:t>
+              <w:t>Viable after caption fix — near parity with audio_only</w:t>
             </w:r>
           </w:p>
         </w:tc>
@@ -1276,7 +1276,7 @@
                 <w:b w:val="0"/>
                 <w:sz w:val="20"/>
               </w:rPr>
-              <w:t>+0.04 (est.)</w:t>
+              <w:t>+0.03 (measured)</w:t>
             </w:r>
           </w:p>
         </w:tc>
@@ -1296,7 +1296,7 @@
                 <w:b w:val="0"/>
                 <w:sz w:val="20"/>
               </w:rPr>
-              <w:t>Marginal gain from cross-attention fusion in both mode</w:t>
+              <w:t>Measured gain from CrossAttentionFusion (v1) in both mode</w:t>
             </w:r>
           </w:p>
         </w:tc>
@@ -1338,7 +1338,7 @@
                 <w:b/>
                 <w:sz w:val="20"/>
               </w:rPr>
-              <w:t>0.78</w:t>
+              <w:t>0.8227</w:t>
             </w:r>
           </w:p>
         </w:tc>
@@ -1358,7 +1358,7 @@
                 <w:b w:val="0"/>
                 <w:sz w:val="20"/>
               </w:rPr>
-              <w:t>Peak — text adds real but modest signal on top of audio</w:t>
+              <w:t>Peak — confirmed on held-out test set (teacher eval F1=0.82)</w:t>
             </w:r>
           </w:p>
         </w:tc>
@@ -1398,7 +1398,7 @@
           <w:i w:val="0"/>
           <w:sz w:val="22"/>
         </w:rPr>
-        <w:t>The 0.78 F1 ceiling is likely data-limited. The model was trained on ~6,900 videos; at this scale, adding more videos is expected to have a larger effect than further hyperparameter tuning. Architecture changes (deeper cross-attention, larger LSTM) showed diminishing returns across 9 trials.</w:t>
+        <w:t>The 0.82 F1 ceiling held across 11+ Optuna trials and three architecture variants (v1 CrossAttentionFusion, v2 DeepCrossAttentionFusion, v3 DeepCrossAttentionFFN). v3 barely exceeded 0.83 after 17 trials. The plateau is driven by frozen DistilBERT and data scale (~6,900 videos), not architecture capacity.</w:t>
       </w:r>
     </w:p>
     <w:p>
@@ -1444,7 +1444,7 @@
           <w:i w:val="0"/>
           <w:sz w:val="22"/>
         </w:rPr>
-        <w:t>Given that audio carries ~95% of the classification signal, future architecture work should focus on the audio branch first — deeper Whisper fine-tuning, larger pooling strategies, or a longer temporal context window. The text branch gains would require unfreezing DistilBERT or using a smaller, fine-tunable encoder.</w:t>
+        <w:t>Audio and text contribute roughly equally (~0.794 vs 0.795 standalone). Future gains likely require: (1) unfreezing DistilBERT last 2 layers (requires regenerating embeddings from raw captions), or (2) expanding the dataset beyond 6,900 videos. Architecture depth has diminishing returns at current data scale.</w:t>
       </w:r>
     </w:p>
     <w:p>
@@ -1467,7 +1467,7 @@
           <w:rFonts w:ascii="Arial" w:hAnsi="Arial"/>
           <w:sz w:val="22"/>
         </w:rPr>
-        <w:t>Wait for audio_only tune to complete (25 trials); record best params into best_params/audio_only.json</w:t>
+        <w:t>Distillation is running: teacher checkpoint (0.82 F1) is being distilled into the student model (keyword CNN + MLP)</w:t>
       </w:r>
     </w:p>
     <w:p>
@@ -1481,7 +1481,7 @@
           <w:rFonts w:ascii="Arial" w:hAnsi="Arial"/>
           <w:sz w:val="22"/>
         </w:rPr>
-        <w:t>Run error analysis on existing teacher_best.pt to identify FP/FN patterns</w:t>
+        <w:t>After distillation: run ONNX export and deploy model.onnx to Chrome extension</w:t>
       </w:r>
     </w:p>
     <w:p>
@@ -1509,7 +1509,7 @@
           <w:rFonts w:ascii="Arial" w:hAnsi="Arial"/>
           <w:sz w:val="22"/>
         </w:rPr>
-        <w:t>If F1 remains plateaued after vote filtering, expand dataset (target: 15,000+ videos)</w:t>
+        <w:t>Future: unfreeze last 2 DistilBERT layers for fine-tuning (requires re-embedding from raw captions)</w:t>
       </w:r>
     </w:p>
     <w:p>
@@ -1523,7 +1523,7 @@
           <w:rFonts w:ascii="Arial" w:hAnsi="Arial"/>
           <w:sz w:val="22"/>
         </w:rPr>
-        <w:t>Consider unfreezing last 2 DistilBERT layers in a future architecture iteration</w:t>
+        <w:t>Architecture ceiling reached with current setup — next improvement requires data scale or DistilBERT fine-tuning</w:t>
       </w:r>
     </w:p>
     <w:p>
@@ -1685,7 +1685,7 @@
                 <w:b w:val="0"/>
                 <w:sz w:val="20"/>
               </w:rPr>
-              <w:t>5.39 × 10⁻⁵</w:t>
+              <w:t>1.38 × 10⁻⁴</w:t>
             </w:r>
           </w:p>
         </w:tc>
@@ -1705,7 +1705,7 @@
                 <w:b w:val="0"/>
                 <w:sz w:val="20"/>
               </w:rPr>
-              <w:t>TBD</w:t>
+              <w:t>1.38 × 10⁻⁴</w:t>
             </w:r>
           </w:p>
         </w:tc>
@@ -1787,7 +1787,7 @@
                 <w:b w:val="0"/>
                 <w:sz w:val="20"/>
               </w:rPr>
-              <w:t>TBD</w:t>
+              <w:t>1.87</w:t>
             </w:r>
           </w:p>
         </w:tc>
@@ -1849,7 +1849,7 @@
                 <w:b w:val="0"/>
                 <w:sz w:val="20"/>
               </w:rPr>
-              <w:t>8.12 × 10⁻³</w:t>
+              <w:t>1.47 × 10⁻⁴</w:t>
             </w:r>
           </w:p>
         </w:tc>
@@ -1869,7 +1869,7 @@
                 <w:b w:val="0"/>
                 <w:sz w:val="20"/>
               </w:rPr>
-              <w:t>8.12 × 10⁻³</w:t>
+              <w:t>1.47 × 10⁻⁴</w:t>
             </w:r>
           </w:p>
         </w:tc>
@@ -1931,7 +1931,7 @@
                 <w:b w:val="0"/>
                 <w:sz w:val="20"/>
               </w:rPr>
-              <w:t>0.21</w:t>
+              <w:t>0.25</w:t>
             </w:r>
           </w:p>
         </w:tc>
@@ -1951,7 +1951,7 @@
                 <w:b w:val="0"/>
                 <w:sz w:val="20"/>
               </w:rPr>
-              <w:t>0.21</w:t>
+              <w:t>0.25</w:t>
             </w:r>
           </w:p>
         </w:tc>
@@ -2013,7 +2013,7 @@
                 <w:b w:val="0"/>
                 <w:sz w:val="20"/>
               </w:rPr>
-              <w:t>256</w:t>
+              <w:t>384</w:t>
             </w:r>
           </w:p>
         </w:tc>
@@ -2033,7 +2033,7 @@
                 <w:b w:val="0"/>
                 <w:sz w:val="20"/>
               </w:rPr>
-              <w:t>256</w:t>
+              <w:t>384</w:t>
             </w:r>
           </w:p>
         </w:tc>
@@ -2095,7 +2095,7 @@
                 <w:b w:val="0"/>
                 <w:sz w:val="20"/>
               </w:rPr>
-              <w:t>2</w:t>
+              <w:t>3</w:t>
             </w:r>
           </w:p>
         </w:tc>
@@ -2115,7 +2115,7 @@
                 <w:b w:val="0"/>
                 <w:sz w:val="20"/>
               </w:rPr>
-              <w:t>2</w:t>
+              <w:t>3</w:t>
             </w:r>
           </w:p>
         </w:tc>
@@ -2259,7 +2259,7 @@
                 <w:b/>
                 <w:sz w:val="20"/>
               </w:rPr>
-              <w:t>0.78</w:t>
+              <w:t>0.8227</w:t>
             </w:r>
           </w:p>
         </w:tc>
@@ -2279,7 +2279,7 @@
                 <w:b/>
                 <w:sz w:val="20"/>
               </w:rPr>
-              <w:t>~0.74 (trial 1)</w:t>
+              <w:t>0.794</w:t>
             </w:r>
           </w:p>
         </w:tc>
@@ -2299,7 +2299,7 @@
                 <w:b/>
                 <w:sz w:val="20"/>
               </w:rPr>
-              <w:t>&lt; 0.10</w:t>
+              <w:t>0.795</w:t>
             </w:r>
           </w:p>
         </w:tc>
@@ -2324,7 +2324,7 @@
           <w:color w:val="828282"/>
           <w:sz w:val="18"/>
         </w:rPr>
-        <w:t>audio_only best params to be recorded after all 25 trials complete. text_only result is conclusive — no further tuning required for that mode.</w:t>
+        <w:t>All three modes complete. Both: 0.8227 (test 0.82). Audio_only: 0.794 (3 trials). Text_only: 0.795 (25 trials, post caption fix). Distillation in progress.</w:t>
       </w:r>
     </w:p>
     <w:sectPr>

</xml_diff>